<commit_message>
chore: remove stray scale note from DVC suitability list
Co-Authored-By: Claude Opus 4.6 (1M context) <noreply@anthropic.com>
</commit_message>
<xml_diff>
--- a/public/brands/DVC/TEXT DVC.docx
+++ b/public/brands/DVC/TEXT DVC.docx
@@ -4488,146 +4488,6 @@
         <w:t>системи</w:t>
       </w:r>
       <w:proofErr w:type="spellEnd"/>
-    </w:p>
-    <w:p>
-      <w:pPr>
-        <w:spacing w:before="100" w:beforeAutospacing="1" w:after="100" w:afterAutospacing="1" w:line="240" w:lineRule="auto"/>
-        <w:rPr>
-          <w:rFonts w:ascii="Times New Roman" w:eastAsia="Times New Roman" w:hAnsi="Times New Roman" w:cs="Times New Roman"/>
-          <w:sz w:val="24"/>
-          <w:szCs w:val="24"/>
-          <w:lang w:eastAsia="en-GB"/>
-        </w:rPr>
-      </w:pPr>
-      <w:r>
-        <w:rPr>
-          <w:rFonts w:ascii="Times New Roman" w:eastAsia="Times New Roman" w:hAnsi="Times New Roman" w:cs="Times New Roman"/>
-          <w:sz w:val="24"/>
-          <w:szCs w:val="24"/>
-          <w:lang w:eastAsia="en-GB"/>
-        </w:rPr>
-        <w:t>(</w:t>
-      </w:r>
-      <w:proofErr w:type="spellStart"/>
-      <w:r>
-        <w:rPr>
-          <w:rFonts w:ascii="Times New Roman" w:eastAsia="Times New Roman" w:hAnsi="Times New Roman" w:cs="Times New Roman"/>
-          <w:sz w:val="24"/>
-          <w:szCs w:val="24"/>
-          <w:lang w:eastAsia="en-GB"/>
-        </w:rPr>
-        <w:t>Подредба</w:t>
-      </w:r>
-      <w:proofErr w:type="spellEnd"/>
-      <w:r>
-        <w:rPr>
-          <w:rFonts w:ascii="Times New Roman" w:eastAsia="Times New Roman" w:hAnsi="Times New Roman" w:cs="Times New Roman"/>
-          <w:sz w:val="24"/>
-          <w:szCs w:val="24"/>
-          <w:lang w:eastAsia="en-GB"/>
-        </w:rPr>
-        <w:t xml:space="preserve"> </w:t>
-      </w:r>
-      <w:proofErr w:type="spellStart"/>
-      <w:r>
-        <w:rPr>
-          <w:rFonts w:ascii="Times New Roman" w:eastAsia="Times New Roman" w:hAnsi="Times New Roman" w:cs="Times New Roman"/>
-          <w:sz w:val="24"/>
-          <w:szCs w:val="24"/>
-          <w:lang w:eastAsia="en-GB"/>
-        </w:rPr>
-        <w:t>според</w:t>
-      </w:r>
-      <w:proofErr w:type="spellEnd"/>
-      <w:r>
-        <w:rPr>
-          <w:rFonts w:ascii="Times New Roman" w:eastAsia="Times New Roman" w:hAnsi="Times New Roman" w:cs="Times New Roman"/>
-          <w:sz w:val="24"/>
-          <w:szCs w:val="24"/>
-          <w:lang w:eastAsia="en-GB"/>
-        </w:rPr>
-        <w:t xml:space="preserve"> </w:t>
-      </w:r>
-      <w:proofErr w:type="spellStart"/>
-      <w:r>
-        <w:rPr>
-          <w:rFonts w:ascii="Times New Roman" w:eastAsia="Times New Roman" w:hAnsi="Times New Roman" w:cs="Times New Roman"/>
-          <w:sz w:val="24"/>
-          <w:szCs w:val="24"/>
-          <w:lang w:eastAsia="en-GB"/>
-        </w:rPr>
-        <w:t>нужните</w:t>
-      </w:r>
-      <w:proofErr w:type="spellEnd"/>
-      <w:r>
-        <w:rPr>
-          <w:rFonts w:ascii="Times New Roman" w:eastAsia="Times New Roman" w:hAnsi="Times New Roman" w:cs="Times New Roman"/>
-          <w:sz w:val="24"/>
-          <w:szCs w:val="24"/>
-          <w:lang w:eastAsia="en-GB"/>
-        </w:rPr>
-        <w:t xml:space="preserve"> </w:t>
-      </w:r>
-      <w:proofErr w:type="spellStart"/>
-      <w:r>
-        <w:rPr>
-          <w:rFonts w:ascii="Times New Roman" w:eastAsia="Times New Roman" w:hAnsi="Times New Roman" w:cs="Times New Roman"/>
-          <w:sz w:val="24"/>
-          <w:szCs w:val="24"/>
-          <w:lang w:eastAsia="en-GB"/>
-        </w:rPr>
-        <w:t>мащаби</w:t>
-      </w:r>
-      <w:proofErr w:type="spellEnd"/>
-      <w:r>
-        <w:rPr>
-          <w:rFonts w:ascii="Times New Roman" w:eastAsia="Times New Roman" w:hAnsi="Times New Roman" w:cs="Times New Roman"/>
-          <w:sz w:val="24"/>
-          <w:szCs w:val="24"/>
-          <w:lang w:eastAsia="en-GB"/>
-        </w:rPr>
-        <w:t xml:space="preserve"> </w:t>
-      </w:r>
-      <w:proofErr w:type="spellStart"/>
-      <w:r>
-        <w:rPr>
-          <w:rFonts w:ascii="Times New Roman" w:eastAsia="Times New Roman" w:hAnsi="Times New Roman" w:cs="Times New Roman"/>
-          <w:sz w:val="24"/>
-          <w:szCs w:val="24"/>
-          <w:lang w:eastAsia="en-GB"/>
-        </w:rPr>
-        <w:t>на</w:t>
-      </w:r>
-      <w:proofErr w:type="spellEnd"/>
-      <w:r>
-        <w:rPr>
-          <w:rFonts w:ascii="Times New Roman" w:eastAsia="Times New Roman" w:hAnsi="Times New Roman" w:cs="Times New Roman"/>
-          <w:sz w:val="24"/>
-          <w:szCs w:val="24"/>
-          <w:lang w:eastAsia="en-GB"/>
-        </w:rPr>
-        <w:t xml:space="preserve"> </w:t>
-      </w:r>
-      <w:proofErr w:type="spellStart"/>
-      <w:r>
-        <w:rPr>
-          <w:rFonts w:ascii="Times New Roman" w:eastAsia="Times New Roman" w:hAnsi="Times New Roman" w:cs="Times New Roman"/>
-          <w:sz w:val="24"/>
-          <w:szCs w:val="24"/>
-          <w:lang w:eastAsia="en-GB"/>
-        </w:rPr>
-        <w:t>системата</w:t>
-      </w:r>
-      <w:proofErr w:type="spellEnd"/>
-      <w:r>
-        <w:rPr>
-          <w:rFonts w:ascii="Times New Roman" w:eastAsia="Times New Roman" w:hAnsi="Times New Roman" w:cs="Times New Roman"/>
-          <w:sz w:val="24"/>
-          <w:szCs w:val="24"/>
-          <w:lang w:eastAsia="en-GB"/>
-        </w:rPr>
-        <w:t xml:space="preserve">) </w:t>
-      </w:r>
     </w:p>
     <w:p>
       <w:pPr>

</xml_diff>